<commit_message>
updated Word and PDF files
</commit_message>
<xml_diff>
--- a/07/07_gyakorlat_HTML5_CSS_responsive_design.docx
+++ b/07/07_gyakorlat_HTML5_CSS_responsive_design.docx
@@ -415,7 +415,13 @@
       </w:r>
       <w:proofErr w:type="spellEnd"/>
       <w:r>
-        <w:t xml:space="preserve"> 2 </w:t>
+        <w:t xml:space="preserve"> </w:t>
+      </w:r>
+      <w:r>
+        <w:t>3</w:t>
+      </w:r>
+      <w:r>
+        <w:t xml:space="preserve"> </w:t>
       </w:r>
       <w:proofErr w:type="spellStart"/>
       <w:r>
@@ -874,7 +880,19 @@
       </w:r>
       <w:proofErr w:type="spellEnd"/>
       <w:r>
-        <w:t xml:space="preserve"> gap </w:t>
+        <w:t xml:space="preserve"> </w:t>
+      </w:r>
+      <w:r>
+        <w:t>“</w:t>
+      </w:r>
+      <w:r>
+        <w:t>gap</w:t>
+      </w:r>
+      <w:r>
+        <w:t>”</w:t>
+      </w:r>
+      <w:r>
+        <w:t xml:space="preserve"> </w:t>
       </w:r>
       <w:proofErr w:type="spellStart"/>
       <w:r>

</xml_diff>